<commit_message>
Fix 5 real defects on Dice Roll found by a simulated 5-student UAT
A missing Appendix E (referenced twice, dropped silently from the HTML
build), an SVG text-overlap bug in the county-comparison diagram, a
missing calculator step for D2's systematic-sampling interval (every
other deliverable had one), unlinked [S#] citation tags forcing a
scroll to the footer and back, and a dense opening paragraph that
reliably led skimming readers to miss the case's core premise.

All fixes verified live in a browser (not just grepped), zero console
errors. Full readiness gate re-passed, including fresh P1/P7 reads
against the rebuilt HTML and a re-confirmation of political
neutrality.

Co-Authored-By: Claude Sonnet 5 <noreply@anthropic.com>
</commit_message>
<xml_diff>
--- a/cases/dice-roll/published/Dice Roll - Case Study.docx
+++ b/cases/dice-roll/published/Dice Roll - Case Study.docx
@@ -109,27 +109,67 @@
         <w:t xml:space="preserve">Here is the concrete question, stripped of the ceremony:</w:t>
       </w:r>
       <w:r>
-        <w:t xml:space="preserve"> Marisol's director wants a list of exactly 5 counties — out of this case's 12-county working roster standing in for Colorado's full 64 — where the Division's own compliance-monitoring team will show up in person this cycle to watch a county audit board work. The dice matter because they are where this case's Statistics-and-Probability content actually lives: they are the real mechanism Colorado's own risk-limiting audit uses to turn "random" from a promise into a number anyone can check and reproduce (SEE APPENDIX B) [S4]. Marisol's own visit-plan choice runs on that identical idea — a public, reproducible chance process — just applied one level up: not which ballots get recounted (state law already fixes that for all 64 counties, no matter what she decides), but which counties a Division observer actually walks into. Two concrete plans sit on her legal pad: </w:t>
-      </w:r>
+        <w:t xml:space="preserve"> Marisol's director wants a list of exactly 5 counties — out of this case's 12-county working roster standing in for Colorado's full 64 — where the Division's own compliance-monitoring team will show up in person this cycle to watch a county audit board work.</w:t>
+      </w:r>
+    </w:p>
+    <w:p>
+      <w:pPr>
+        <w:ind w:left="480"/>
+      </w:pPr>
       <w:r>
         <w:rPr>
           <w:b/>
           <w:bCs/>
         </w:rPr>
-        <w:t xml:space="preserve">The Statewide Draw</w:t>
-      </w:r>
-      <w:r>
-        <w:t xml:space="preserve">, which lets a chance process pick both the counties and the sessions inside them, and </w:t>
+        <w:t xml:space="preserve">The one distinction to hold onto:</w:t>
+      </w:r>
+      <w:r>
+        <w:t xml:space="preserve"> the risk-limiting audit itself is required in all 64 counties, every cycle, no matter what Marisol decides. Nothing about her choice changes whether a county gets audited. What she's actually deciding is narrower — which counties a Division </w:t>
+      </w:r>
+      <w:r>
+        <w:rPr>
+          <w:i/>
+          <w:iCs/>
+        </w:rPr>
+        <w:t xml:space="preserve">observer</w:t>
+      </w:r>
+      <w:r>
+        <w:t xml:space="preserve"> shows up to watch in person.</w:t>
+      </w:r>
+    </w:p>
+    <w:p>
+      <w:r>
+        <w:t xml:space="preserve">The dice matter because they are where this case's Statistics-and-Probability content actually lives: they are the real mechanism Colorado's own risk-limiting audit uses to turn "random" from a promise into a number anyone can check and reproduce (SEE APPENDIX B) [S4]. Marisol's own visit-plan choice runs on that identical idea — a public, reproducible chance process — just applied one level up: not which ballots get recounted, but which counties a Division observer actually walks into.</w:t>
+      </w:r>
+    </w:p>
+    <w:p>
+      <w:r>
+        <w:t xml:space="preserve">Two concrete plans sit on her legal pad: </w:t>
       </w:r>
       <w:r>
         <w:rPr>
           <w:b/>
           <w:bCs/>
         </w:rPr>
+        <w:t xml:space="preserve">The Statewide Draw</w:t>
+      </w:r>
+      <w:r>
+        <w:t xml:space="preserve">, which lets a chance process pick both the counties and the sessions inside them, and </w:t>
+      </w:r>
+      <w:r>
+        <w:rPr>
+          <w:b/>
+          <w:bCs/>
+        </w:rPr>
         <w:t xml:space="preserve">The Front Range Loop</w:t>
       </w:r>
       <w:r>
-        <w:t xml:space="preserve">, which simply sends the team to the 5 counties closest to Denver every time, no draw involved. Simple random sampling, systematic sampling, cluster sampling, and multistage sampling — the four tools this case asks a Hero to actually use — are not exotic or invented for this exercise: OpenStax's </w:t>
+        <w:t xml:space="preserve">, which simply sends the team to the 5 counties closest to Denver every time, no draw involved.</w:t>
+      </w:r>
+    </w:p>
+    <w:p>
+      <w:r>
+        <w:t xml:space="preserve">Simple random sampling, systematic sampling, cluster sampling, and multistage sampling — the four tools this case asks a Hero to actually use — are not exotic or invented for this exercise: OpenStax's </w:t>
       </w:r>
       <w:r>
         <w:rPr>
@@ -139,7 +179,12 @@
         <w:t xml:space="preserve">Introductory Statistics</w:t>
       </w:r>
       <w:r>
-        <w:t xml:space="preserve"> textbook lists the stratified, cluster, and systematic sample as the standard "well-known" alternatives taught alongside simple random sampling in any first statistics course [S9], and pairing a random county draw with a random within-county subsample — exactly what The Statewide Draw does — is the textbook definition of a multistage sample. What genuinely isn't public record is whether Colorado's real Division uses one of these methods, or something else entirely, to pick which counties its own compliance-monitoring team visits in person; no such policy is published (SEE APPENDIX D), so this case models that specific choice as the open, unresolved question it actually is, not a foregone conclusion dressed up as one.</w:t>
+        <w:t xml:space="preserve"> textbook lists the stratified, cluster, and systematic sample as the standard "well-known" alternatives taught alongside simple random sampling in any first statistics course [S9], and pairing a random county draw with a random within-county subsample — exactly what The Statewide Draw does — is the textbook definition of a multistage sample.</w:t>
+      </w:r>
+    </w:p>
+    <w:p>
+      <w:r>
+        <w:t xml:space="preserve">What genuinely isn't public record is whether Colorado's real Division uses one of these methods, or something else entirely, to pick which counties its own compliance-monitoring team visits in person; no such policy is published (SEE APPENDIX D), so this case models that specific choice as the open, unresolved question it actually is, not a foregone conclusion dressed up as one.</w:t>
       </w:r>
     </w:p>
     <w:p>
@@ -2296,7 +2341,7 @@
             <w:r>
               <w:t xml:space="preserve">Colorado Department of State / Verified Voting — </w:t>
             </w:r>
-            <w:hyperlink w:history="1" r:id="rId0ywufzvg4ljzzf9xvsxmq">
+            <w:hyperlink w:history="1" r:id="rIdsikypyx_myg3t-q_ymgzw">
               <w:r>
                 <w:rPr>
                   <w:rStyle w:val="Hyperlink"/>
@@ -2366,7 +2411,7 @@
             <w:r>
               <w:t xml:space="preserve">Justia — </w:t>
             </w:r>
-            <w:hyperlink w:history="1" r:id="rIdotlcyfhvqseg9gf2q-pyj">
+            <w:hyperlink w:history="1" r:id="rIdhzmh2ancwlju-bq0zpw5p">
               <w:r>
                 <w:rPr>
                   <w:rStyle w:val="Hyperlink"/>
@@ -2436,7 +2481,7 @@
             <w:r>
               <w:t xml:space="preserve">Colorado Secretary of State — </w:t>
             </w:r>
-            <w:hyperlink w:history="1" r:id="rIdi1ttxgyvuf1f2rkqmurq-">
+            <w:hyperlink w:history="1" r:id="rId10xz1_dbfls7w5ug0km1_">
               <w:r>
                 <w:rPr>
                   <w:rStyle w:val="Hyperlink"/>
@@ -2506,7 +2551,7 @@
             <w:r>
               <w:t xml:space="preserve">Colorado Secretary of State — </w:t>
             </w:r>
-            <w:hyperlink w:history="1" r:id="rIduopaim6l65mseegpbrcpc">
+            <w:hyperlink w:history="1" r:id="rId8_92duutxeh7xtifla9jg">
               <w:r>
                 <w:rPr>
                   <w:rStyle w:val="Hyperlink"/>
@@ -2700,7 +2745,7 @@
             <w:r>
               <w:t xml:space="preserve">University of Colorado, Payroll &amp; Benefit Services — </w:t>
             </w:r>
-            <w:hyperlink w:history="1" r:id="rIdotukitne60fujwh4fks2z">
+            <w:hyperlink w:history="1" r:id="rId0u_o89zq-ybt1duo3vrob">
               <w:r>
                 <w:rPr>
                   <w:rStyle w:val="Hyperlink"/>
@@ -2773,7 +2818,7 @@
             <w:r>
               <w:t xml:space="preserve">U.S. General Services Administration — </w:t>
             </w:r>
-            <w:hyperlink w:history="1" r:id="rId_pqppnb9g-b0tg6eiypce">
+            <w:hyperlink w:history="1" r:id="rIdpe5rdeytzxzfuhwu86t6s">
               <w:r>
                 <w:rPr>
                   <w:rStyle w:val="Hyperlink"/>
@@ -2784,7 +2829,7 @@
             <w:r>
               <w:t xml:space="preserve"> (rates unchanged from FY2025; exact $110/$68 split confirmed via GSA-sourced per diem aggregator, PerDiemWorld — </w:t>
             </w:r>
-            <w:hyperlink w:history="1" r:id="rIdxf_eteqowmjtormjhdvby">
+            <w:hyperlink w:history="1" r:id="rIdjbe2zdrhda1gh0pi-fm_k">
               <w:r>
                 <w:rPr>
                   <w:rStyle w:val="Hyperlink"/>
@@ -2857,7 +2902,7 @@
             <w:r>
               <w:t xml:space="preserve">OpenStax — </w:t>
             </w:r>
-            <w:hyperlink w:history="1" r:id="rIdvjnk2l7qd1kft7cezqxmj">
+            <w:hyperlink w:history="1" r:id="rIdspmvwgq4xatj55c4kinqu">
               <w:r>
                 <w:rPr>
                   <w:rStyle w:val="Hyperlink"/>

</xml_diff>